<commit_message>
fix: Teststrategie-Vorlage folgt jetzt der Gliederung der Referenz
Die eigentliche Kapitelstruktur der Teststrategie kam bisher aus den
Heading-1-Ueberschriften von WARP_Teststrategie.docx, nicht aus dem
Referenzdokument (das bisher nur als Stil-/Ton-Vorbild INNERHALB der
alten, kuerzeren 8-Kapitel-Struktur diente) - dadurch hielt sich das
generierte Dokument trotz Referenz nicht an deren Gliederung.

Vorlage auf 11 Kapitel umgestellt, die sich an der Struktur der
Referenz orientieren (Management Summary, Ziele/Geltungsbereich,
Testpyramide, Testautomatisierungs-Framework, anwendungsspezifische
Testaspekte, CI/CD-Integration, Testmanagement-Integration, Rollen &
Governance, Metriken & Reporting, Risiken, Roadmap) - bewusst
tool-agnostisch formuliert statt SAP-GUI/Playwright-spezifisch, da
der Inhalt weiterhin aus dem jeweiligen WARP-Assessment kommt.
</commit_message>
<xml_diff>
--- a/app/static/docs/WARP_Teststrategie.docx
+++ b/app/static/docs/WARP_Teststrategie.docx
@@ -1391,156 +1391,156 @@
       <w:pPr>
         <w:pStyle w:val="berschrift1"/>
       </w:pPr>
-      <w:bookmarkStart w:id="0" w:name="_Toc231401387"/>
       <w:r>
-        <w:lastRenderedPageBreak/>
-        <w:t>Ziel &amp; Scope</w:t>
+        <w:t>Management Summary</w:t>
       </w:r>
-      <w:bookmarkEnd w:id="0"/>
     </w:p>
     <w:p>
+      <w:pPr/>
       <w:r>
-        <w:t>Beschreibt die übergeordneten Qualitätsziele sowie den Scope der Teststrategie inkl. Systeme und Organisationseinheiten.</w:t>
+        <w:t>Kurzfassung: Ausgangslage, Kernziele und wichtigste Handlungsfelder der Teststrategie auf einen Blick.</w:t>
       </w:r>
     </w:p>
     <w:p>
       <w:pPr>
         <w:pStyle w:val="berschrift1"/>
       </w:pPr>
-      <w:bookmarkStart w:id="1" w:name="_Toc231401388"/>
       <w:r>
-        <w:t>Governance &amp; Operating Model</w:t>
+        <w:t>Ziele, Geltungsbereich und Rahmenbedingungen</w:t>
       </w:r>
-      <w:bookmarkEnd w:id="1"/>
     </w:p>
     <w:p>
+      <w:pPr/>
       <w:r>
-        <w:t>Definiert Rollen, Verantwortlichkeiten sowie Entscheidungs- und Eskalationsstrukturen.</w:t>
+        <w:t>Beschreibt die übergeordneten Qualitätsziele, den fachlichen und technischen Scope sowie regulatorische oder organisatorische Rahmenbedingungen.</w:t>
       </w:r>
     </w:p>
     <w:p>
       <w:pPr>
         <w:pStyle w:val="berschrift1"/>
       </w:pPr>
-      <w:bookmarkStart w:id="2" w:name="_Toc231401389"/>
       <w:r>
-        <w:t>Testansatz &amp; Methodik</w:t>
+        <w:t>Teststrategie nach der Testpyramide</w:t>
       </w:r>
-      <w:bookmarkEnd w:id="2"/>
     </w:p>
     <w:p>
+      <w:pPr/>
       <w:r>
-        <w:t xml:space="preserve">Beschreibt den methodischen Ansatz (z. B. </w:t>
-      </w:r>
-      <w:proofErr w:type="spellStart"/>
-      <w:r>
-        <w:t>risk-based</w:t>
-      </w:r>
-      <w:proofErr w:type="spellEnd"/>
-      <w:r>
-        <w:t xml:space="preserve">, agil, hybrid) und Integration in den </w:t>
-      </w:r>
-      <w:proofErr w:type="spellStart"/>
-      <w:r>
-        <w:t>Delivery</w:t>
-      </w:r>
-      <w:proofErr w:type="spellEnd"/>
-      <w:r>
-        <w:t>-Prozess.</w:t>
+        <w:t>Verteilung der Testaktivitäten über die Testebenen (Unit, Integration, System/E2E, manuell/explorativ) inkl. Zielanteilen und Kritikalitätseinstufung.</w:t>
       </w:r>
     </w:p>
     <w:p>
       <w:pPr>
         <w:pStyle w:val="berschrift1"/>
       </w:pPr>
-      <w:bookmarkStart w:id="3" w:name="_Toc231401390"/>
       <w:r>
-        <w:t>Testlevels &amp; Testarten</w:t>
+        <w:t>Testautomatisierungs-Framework</w:t>
       </w:r>
-      <w:bookmarkEnd w:id="3"/>
     </w:p>
     <w:p>
+      <w:pPr/>
       <w:r>
-        <w:t>Überblick über alle Teststufen und relevanten Testarten.</w:t>
+        <w:t>Architektur, Werkzeugwahl und Aufbau der Testautomatisierung inkl. Repository-Struktur und Wartungsstrategie.</w:t>
       </w:r>
     </w:p>
     <w:p>
       <w:pPr>
         <w:pStyle w:val="berschrift1"/>
       </w:pPr>
-      <w:bookmarkStart w:id="4" w:name="_Toc231401391"/>
       <w:r>
-        <w:t>Tooling</w:t>
+        <w:t>Anwendungsspezifische Testaspekte</w:t>
       </w:r>
-      <w:bookmarkEnd w:id="4"/>
     </w:p>
     <w:p>
+      <w:pPr/>
       <w:r>
-        <w:t xml:space="preserve">Beschreibung der eingesetzten Testmanagement- und </w:t>
-      </w:r>
-      <w:proofErr w:type="spellStart"/>
-      <w:r>
-        <w:t>Defect</w:t>
-      </w:r>
-      <w:proofErr w:type="spellEnd"/>
-      <w:r>
-        <w:t>-Tools sowie Integration.</w:t>
+        <w:t>Besonderheiten der eingesetzten Anwendungslandschaft, die die Testautomatisierung beeinflussen (z. B. Selektorstrategie, Asynchronität, Navigationslogik).</w:t>
       </w:r>
     </w:p>
     <w:p>
       <w:pPr>
         <w:pStyle w:val="berschrift1"/>
       </w:pPr>
-      <w:bookmarkStart w:id="5" w:name="_Toc231401392"/>
       <w:r>
-        <w:t>Risikomanagement</w:t>
+        <w:t>CI/CD-Integration</w:t>
       </w:r>
-      <w:bookmarkEnd w:id="5"/>
     </w:p>
     <w:p>
+      <w:pPr/>
       <w:r>
-        <w:t>Vorgehen zur Identifikation und Priorisierung von Risiken.</w:t>
+        <w:t>Einbettung der automatisierten Tests in die Build- und Deployment-Pipeline inkl. Stufenmodell, Trigger und Quality Gates.</w:t>
       </w:r>
     </w:p>
     <w:p>
       <w:pPr>
         <w:pStyle w:val="berschrift1"/>
       </w:pPr>
-      <w:bookmarkStart w:id="6" w:name="_Toc231401393"/>
       <w:r>
-        <w:t>Reporting &amp; KPIs</w:t>
+        <w:t>Testmanagement-Integration</w:t>
       </w:r>
-      <w:bookmarkEnd w:id="6"/>
     </w:p>
     <w:p>
+      <w:pPr/>
       <w:r>
-        <w:t xml:space="preserve">Definition zentraler KPIs sowie </w:t>
-      </w:r>
-      <w:proofErr w:type="spellStart"/>
-      <w:r>
-        <w:t>Reportingstruktur</w:t>
-      </w:r>
-      <w:proofErr w:type="spellEnd"/>
-      <w:r>
-        <w:t>.</w:t>
+        <w:t>Verzahnung mit dem eingesetzten Testmanagement-Tool: Struktur der Testfälle, Ergebnis-Import und Traceability.</w:t>
       </w:r>
     </w:p>
     <w:p>
       <w:pPr>
         <w:pStyle w:val="berschrift1"/>
       </w:pPr>
-      <w:bookmarkStart w:id="7" w:name="_Toc231401394"/>
       <w:r>
-        <w:t>Roadmap</w:t>
+        <w:t>Rollen, Verantwortlichkeiten und Governance</w:t>
       </w:r>
-      <w:bookmarkEnd w:id="7"/>
     </w:p>
     <w:p>
+      <w:pPr/>
       <w:r>
-        <w:t>Maßnahmen zur kontinuierlichen Verbesserung der Testorganisation.</w:t>
+        <w:t>Definiert Rollen, Verantwortlichkeiten (RACI) sowie Entscheidungs- und Eskalationsstrukturen.</w:t>
       </w:r>
     </w:p>
-    <w:p/>
+    <w:p>
+      <w:pPr>
+        <w:pStyle w:val="berschrift1"/>
+      </w:pPr>
+      <w:r>
+        <w:t>Metriken, Reporting und kontinuierliche Verbesserung</w:t>
+      </w:r>
+    </w:p>
+    <w:p>
+      <w:pPr/>
+      <w:r>
+        <w:t>Zentrale KPIs, Reporting-Kadenz und Vorgehen zur kontinuierlichen Verbesserung der Testorganisation.</w:t>
+      </w:r>
+    </w:p>
+    <w:p>
+      <w:pPr>
+        <w:pStyle w:val="berschrift1"/>
+      </w:pPr>
+      <w:r>
+        <w:t>Risiken und Mitigationsmaßnahmen</w:t>
+      </w:r>
+    </w:p>
+    <w:p>
+      <w:pPr/>
+      <w:r>
+        <w:t>Identifikation, Bewertung und Gegenmaßnahmen für die zentralen Risiken der Teststrategie.</w:t>
+      </w:r>
+    </w:p>
+    <w:p>
+      <w:pPr>
+        <w:pStyle w:val="berschrift1"/>
+      </w:pPr>
+      <w:r>
+        <w:t>Einführungs-Roadmap</w:t>
+      </w:r>
+    </w:p>
+    <w:p>
+      <w:pPr/>
+      <w:r>
+        <w:t>Phasenplan zur Einführung und Skalierung der Testautomatisierung.</w:t>
+      </w:r>
+    </w:p>
     <w:sectPr>
       <w:footerReference w:type="default" r:id="rId17"/>
       <w:footerReference w:type="first" r:id="rId18"/>

</xml_diff>